<commit_message>
docs: fix engineering spec v1.1 — CDF scope, permutation strategy, GOE factor
Critical corrections for replication accuracy:
1. Section 6.1: CDF scope was "for that event" (event-scope) → corrected to
   GLOBAL scope (CDFs built from all 142 analyzed events before any test)
2. Section 8.2: adaptive M=1,000→10,000 strategy → corrected to flat M=10,000
   for all events (matches actual published run)
3. Section 2.1: factor[r] clarified — must use goe_factors table, NOT
   goe_factor_inferred (unreliable for combined elements SyTw/OFT/DiSt)
4. Para 11/88: "5,000–10,000" → "10,000" throughout
5. Version bumped to 1.1; last-verified stamp added 2026-02-26

Co-Authored-By: Claude Sonnet 4.6 <noreply@anthropic.com>
</commit_message>
<xml_diff>
--- a/engineering_spec_isuimpact_v1.docx
+++ b/engineering_spec_isuimpact_v1.docx
@@ -27,7 +27,7 @@
         <w:jc w:val="center"/>
       </w:pPr>
       <w:r>
-        <w:t>Version 1.0 • 2026-02-24</w:t>
+        <w:t>Version 1.1 • 2026-02-26  |  Last verified: 2026-02-26</w:t>
       </w:r>
     </w:p>
     <w:p/>
@@ -123,11 +123,9 @@
         <w:rPr>
           <w:b/>
         </w:rPr>
-        <w:t xml:space="preserve">Scaling: </w:t>
+        <w:t>Scaling: Compute per event (parallelize across events). Avoid storing all permutation draws; update exceedance counters streaming. Use M=10,000 permutations for publication-grade p-value resolution (flat across all events; see Section 8.2).</w:t>
       </w:r>
-      <w:r>
-        <w:t>Compute per event (parallelize across events). Avoid storing all permutation draws; update exceedance counters streaming. Use 5,000–10,000 permutations for publication-grade p-value resolution.</w:t>
-      </w:r>
+      <w:r/>
     </w:p>
     <w:p>
       <w:pPr>
@@ -284,7 +282,7 @@
         <w:pStyle w:val="ListBullet"/>
       </w:pPr>
       <w:r>
-        <w:t>factor[r] (GOE multiplier m_r for GOE rows; PCS factor f_r for PCS rows)</w:t>
+        <w:t>factor[r] (GOE multiplier m_r for GOE rows; PCS factor f_r for PCS rows). IMPORTANT — for GOE rows, obtain factor[r] from the goe_factors reference table (matched by season, discipline, element_pattern). Do NOT use goe_factor_inferred from the elements table: for combined elements (SyTw, OFT, DiSt in ice dance), goe_factor_inferred is unreliable because the trimmed mean spans multiple sub-elements. The effective factor is panel_goe_points / trimmed_mean_goe computed directly from raw judge scores.</w:t>
       </w:r>
     </w:p>
     <w:p>
@@ -663,7 +661,7 @@
     </w:p>
     <w:p>
       <w:r>
-        <w:t>For each judge j and category c, collect all observed marks for that event (or segment) and store the sorted sample array samples[j,c].</w:t>
+        <w:t>For each judge j and category c, collect all observed marks across ALL events in the dataset and store the sorted sample array samples[j,c]. IMPORTANT — CDF scope is GLOBAL: empirical CDFs are built once from the full multi-event database (all analyzed events) before any permutation test is run. Do not build per-event CDFs; using only the single event under test would produce different (and incorrect) quantile mappings.</w:t>
       </w:r>
     </w:p>
     <w:p>
@@ -985,7 +983,7 @@
     </w:p>
     <w:p>
       <w:r>
-        <w:t>8.2 Adaptive permutation strategy (recommended)</w:t>
+        <w:t>8.2 Permutation strategy (publication setting)</w:t>
       </w:r>
     </w:p>
     <w:p>
@@ -993,7 +991,7 @@
         <w:pStyle w:val="ListBullet"/>
       </w:pPr>
       <w:r>
-        <w:t>Run M=1,000 for all events initially; escalate to M=10,000 only for tests that are near a reporting threshold (e.g., q ≤ 0.10).</w:t>
+        <w:t>Use a FLAT M=10,000 permutations for ALL events uniformly. The published results (seed=20260223) used M=10,000 uniformly across all 142 analyzed events — not an adaptive strategy. An adaptive approach (escalate from M=1,000 near threshold) is viable for development/exploration but was not used for publication and should not be used when reproducing the published results.</w:t>
       </w:r>
     </w:p>
     <w:p>
@@ -1282,7 +1280,7 @@
         <w:pStyle w:val="ListBullet"/>
       </w:pPr>
       <w:r>
-        <w:t>Permutations: 5,000 for development; 10,000 for publication</w:t>
+        <w:t>Permutations: 10,000 (flat across all events; used for all published results)</w:t>
       </w:r>
     </w:p>
     <w:p>

</xml_diff>